<commit_message>
vault backup: 2025-04-15 02:11:26
</commit_message>
<xml_diff>
--- a/University/SoftEng/Document 1.docx
+++ b/University/SoftEng/Document 1.docx
@@ -14,7 +14,7 @@
         <mc:AlternateContent>
           <mc:Choice Requires="wps">
             <w:drawing>
-              <wp:anchor distT="0" distB="0" distL="114300" distR="114300" simplePos="0" relativeHeight="251659264" behindDoc="1" locked="1" layoutInCell="1" allowOverlap="1" wp14:anchorId="423DCCEB" wp14:editId="64F1FB81">
+              <wp:anchor distT="0" distB="0" distL="114300" distR="114300" simplePos="0" relativeHeight="251659264" behindDoc="1" locked="1" layoutInCell="1" allowOverlap="1" wp14:anchorId="423DCCEB" wp14:editId="1B92328A">
                 <wp:simplePos x="0" y="0"/>
                 <wp:positionH relativeFrom="page">
                   <wp:posOffset>0</wp:posOffset>
@@ -91,7 +91,7 @@
           </mc:Choice>
           <mc:Fallback>
             <w:pict>
-              <v:rect w14:anchorId="14FBAA13" id="Rectangle 1" o:spid="_x0000_s1026" alt="&quot;&quot;" style="position:absolute;margin-left:0;margin-top:0;width:612pt;height:11in;z-index:-251657216;visibility:visible;mso-wrap-style:square;mso-width-percent:0;mso-height-percent:0;mso-wrap-distance-left:9pt;mso-wrap-distance-top:0;mso-wrap-distance-right:9pt;mso-wrap-distance-bottom:0;mso-position-horizontal:absolute;mso-position-horizontal-relative:page;mso-position-vertical:absolute;mso-position-vertical-relative:page;mso-width-percent:0;mso-height-percent:0;mso-width-relative:page;mso-height-relative:page;v-text-anchor:middle" o:gfxdata="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" fillcolor="#f2f0ee [661]" stroked="f" strokeweight="1.25pt">
+              <v:rect w14:anchorId="17755FEF" id="Rectangle 1" o:spid="_x0000_s1026" alt="&quot;&quot;" style="position:absolute;margin-left:0;margin-top:0;width:612pt;height:11in;z-index:-251657216;visibility:visible;mso-wrap-style:square;mso-width-percent:0;mso-height-percent:0;mso-wrap-distance-left:9pt;mso-wrap-distance-top:0;mso-wrap-distance-right:9pt;mso-wrap-distance-bottom:0;mso-position-horizontal:absolute;mso-position-horizontal-relative:page;mso-position-vertical:absolute;mso-position-vertical-relative:page;mso-width-percent:0;mso-height-percent:0;mso-width-relative:page;mso-height-relative:page;v-text-anchor:middle" o:gfxdata="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" fillcolor="#f2f0ee [661]" stroked="f" strokeweight="1.25pt">
                 <w10:wrap anchorx="page" anchory="page"/>
                 <w10:anchorlock/>
               </v:rect>
@@ -222,7 +222,10 @@
           </w:tcPr>
           <w:p>
             <w:r>
-              <w:t>February 13</w:t>
+              <w:t>February 1</w:t>
+            </w:r>
+            <w:r>
+              <w:t>9</w:t>
             </w:r>
             <w:r>
               <w:rPr>
@@ -277,7 +280,10 @@
           </w:tcPr>
           <w:p>
             <w:r>
-              <w:t>4:00 PM</w:t>
+              <w:t>2</w:t>
+            </w:r>
+            <w:r>
+              <w:t>:00 PM</w:t>
             </w:r>
             <w:r>
               <w:t xml:space="preserve"> </w:t>
@@ -335,7 +341,7 @@
           </w:tcPr>
           <w:p>
             <w:r>
-              <w:t>Rojan</w:t>
+              <w:t>Yin</w:t>
             </w:r>
             <w:r>
               <w:t xml:space="preserve"> </w:t>
@@ -369,7 +375,15 @@
     </w:p>
     <w:p>
       <w:r>
-        <w:t>Zain, Yin, Kito, Naputt, Basel</w:t>
+        <w:t xml:space="preserve">Yin, Kito, </w:t>
+      </w:r>
+      <w:proofErr w:type="spellStart"/>
+      <w:r>
+        <w:t>Naputt</w:t>
+      </w:r>
+      <w:proofErr w:type="spellEnd"/>
+      <w:r>
+        <w:t>, Basel</w:t>
       </w:r>
       <w:r>
         <w:t xml:space="preserve"> </w:t>
@@ -380,18 +394,12 @@
         <w:pStyle w:val="Heading1"/>
       </w:pPr>
       <w:r>
-        <w:t>Roles Assigned</w:t>
+        <w:t>TAsks Done</w:t>
       </w:r>
     </w:p>
     <w:p>
       <w:r>
-        <w:t xml:space="preserve">Rojan – CH, Yin – CF, Zain – ME, Kito - </w:t>
-      </w:r>
-      <w:r>
-        <w:t xml:space="preserve"> </w:t>
-      </w:r>
-      <w:r>
-        <w:t>ME/TW, Naputt – TW, Basel – RI</w:t>
+        <w:t>Database completed, authentication completed, navbar, login functionality</w:t>
       </w:r>
     </w:p>
     <w:p>
@@ -403,22 +411,23 @@
       </w:r>
     </w:p>
     <w:p>
+      <w:pPr>
+        <w:pStyle w:val="ListParagraph"/>
+        <w:numPr>
+          <w:ilvl w:val="0"/>
+          <w:numId w:val="25"/>
+        </w:numPr>
+      </w:pPr>
       <w:r>
-        <w:t xml:space="preserve">Chose project 1. Team strengths. </w:t>
+        <w:t xml:space="preserve">Focus front end, search function, </w:t>
       </w:r>
+      <w:proofErr w:type="gramStart"/>
       <w:r>
-        <w:t xml:space="preserve">For development approach decided on Test-Driven Development. </w:t>
+        <w:t>rides</w:t>
       </w:r>
+      <w:proofErr w:type="gramEnd"/>
       <w:r>
-        <w:t>Belbin/Assigned Roles.</w:t>
-      </w:r>
-      <w:r>
-        <w:t xml:space="preserve"> </w:t>
-      </w:r>
-    </w:p>
-    <w:p>
-      <w:r>
-        <w:t xml:space="preserve">Roles: </w:t>
+        <w:t xml:space="preserve"> and manager view</w:t>
       </w:r>
     </w:p>
     <w:p>
@@ -426,11 +435,11 @@
         <w:pStyle w:val="ListParagraph"/>
         <w:numPr>
           <w:ilvl w:val="0"/>
-          <w:numId w:val="24"/>
+          <w:numId w:val="25"/>
         </w:numPr>
       </w:pPr>
       <w:r>
-        <w:t xml:space="preserve">Basel + Kito – Front End </w:t>
+        <w:t>Backend, link all current pages</w:t>
       </w:r>
     </w:p>
     <w:p>
@@ -438,11 +447,11 @@
         <w:pStyle w:val="ListParagraph"/>
         <w:numPr>
           <w:ilvl w:val="0"/>
-          <w:numId w:val="24"/>
+          <w:numId w:val="25"/>
         </w:numPr>
       </w:pPr>
       <w:r>
-        <w:t>Yin + Naputt – Investigate Backend</w:t>
+        <w:t>Tests on authentication</w:t>
       </w:r>
     </w:p>
     <w:p>
@@ -450,11 +459,11 @@
         <w:pStyle w:val="ListParagraph"/>
         <w:numPr>
           <w:ilvl w:val="0"/>
-          <w:numId w:val="24"/>
+          <w:numId w:val="25"/>
         </w:numPr>
       </w:pPr>
       <w:r>
-        <w:t>Naputt – Create Database</w:t>
+        <w:t>Github, create more individual tasks, set up milestones, descriptive labelling</w:t>
       </w:r>
     </w:p>
     <w:p>
@@ -462,23 +471,11 @@
         <w:pStyle w:val="ListParagraph"/>
         <w:numPr>
           <w:ilvl w:val="0"/>
-          <w:numId w:val="24"/>
+          <w:numId w:val="25"/>
         </w:numPr>
       </w:pPr>
       <w:r>
-        <w:t>Zain – Minutes + Short Documentation</w:t>
-      </w:r>
-    </w:p>
-    <w:p>
-      <w:pPr>
-        <w:pStyle w:val="ListParagraph"/>
-        <w:numPr>
-          <w:ilvl w:val="0"/>
-          <w:numId w:val="24"/>
-        </w:numPr>
-      </w:pPr>
-      <w:r>
-        <w:t xml:space="preserve">Rojan – Github + Backlogs </w:t>
+        <w:t>Documentation, polished minutes</w:t>
       </w:r>
     </w:p>
     <w:p>
@@ -486,66 +483,35 @@
         <w:pStyle w:val="Heading1"/>
       </w:pPr>
       <w:r>
-        <w:t>Actions FOr nExt meeting</w:t>
+        <w:t>Roles</w:t>
       </w:r>
     </w:p>
     <w:p>
-      <w:pPr>
-        <w:pStyle w:val="ListParagraph"/>
-        <w:numPr>
-          <w:ilvl w:val="0"/>
-          <w:numId w:val="24"/>
-        </w:numPr>
-      </w:pPr>
       <w:r>
-        <w:t xml:space="preserve">Review progress </w:t>
+        <w:t>Front End: Kito + Basel</w:t>
       </w:r>
     </w:p>
     <w:p>
-      <w:pPr>
-        <w:pStyle w:val="ListParagraph"/>
-        <w:numPr>
-          <w:ilvl w:val="0"/>
-          <w:numId w:val="24"/>
-        </w:numPr>
-      </w:pPr>
       <w:r>
-        <w:t>Address roadblocks (frontend/backend investigations)</w:t>
+        <w:t xml:space="preserve">Backend: Yin + </w:t>
+      </w:r>
+      <w:proofErr w:type="spellStart"/>
+      <w:r>
+        <w:t>Naputt</w:t>
+      </w:r>
+      <w:proofErr w:type="spellEnd"/>
+    </w:p>
+    <w:p>
+      <w:r>
+        <w:t>Documentation: Zain</w:t>
       </w:r>
     </w:p>
     <w:p>
-      <w:pPr>
-        <w:pStyle w:val="ListParagraph"/>
-        <w:numPr>
-          <w:ilvl w:val="0"/>
-          <w:numId w:val="24"/>
-        </w:numPr>
-      </w:pPr>
       <w:r>
-        <w:t>Ensure initial database structure in place</w:t>
+        <w:t>Github + Testing: Rojan</w:t>
       </w:r>
     </w:p>
     <w:p>
-      <w:pPr>
-        <w:pStyle w:val="Heading1"/>
-      </w:pPr>
-      <w:sdt>
-        <w:sdtPr>
-          <w:id w:val="188813862"/>
-          <w:placeholder>
-            <w:docPart w:val="8711DA350F0E4AA7A155F20F3B3A55F3"/>
-          </w:placeholder>
-          <w:temporary/>
-          <w:showingPlcHdr/>
-          <w15:appearance w15:val="hidden"/>
-        </w:sdtPr>
-        <w:sdtEndPr/>
-        <w:sdtContent>
-          <w:r>
-            <w:t>Next meeting</w:t>
-          </w:r>
-        </w:sdtContent>
-      </w:sdt>
       <w:r>
         <w:t xml:space="preserve"> </w:t>
       </w:r>
@@ -558,7 +524,13 @@
         <w:rPr>
           <w:rFonts w:eastAsiaTheme="minorEastAsia" w:cstheme="minorBidi"/>
         </w:rPr>
-        <w:t>Next meeting February 19</w:t>
+        <w:t xml:space="preserve">Next meeting February </w:t>
+      </w:r>
+      <w:r>
+        <w:rPr>
+          <w:rFonts w:eastAsiaTheme="minorEastAsia" w:cstheme="minorBidi"/>
+        </w:rPr>
+        <w:t>26</w:t>
       </w:r>
       <w:r>
         <w:rPr>
@@ -574,48 +546,7 @@
         <w:t xml:space="preserve"> </w:t>
       </w:r>
       <w:r>
-        <w:t xml:space="preserve"> </w:t>
-      </w:r>
-    </w:p>
-    <w:p>
-      <w:pPr>
-        <w:rPr>
-          <w:rFonts w:eastAsiaTheme="majorEastAsia" w:cstheme="majorBidi"/>
-          <w:sz w:val="24"/>
-          <w:szCs w:val="24"/>
-        </w:rPr>
-      </w:pPr>
-      <w:sdt>
-        <w:sdtPr>
-          <w:id w:val="-815259512"/>
-          <w:placeholder>
-            <w:docPart w:val="95974D562C8E4C2B8678C50586F60087"/>
-          </w:placeholder>
-          <w:temporary/>
-          <w:showingPlcHdr/>
-          <w15:appearance w15:val="hidden"/>
-        </w:sdtPr>
-        <w:sdtEndPr/>
-        <w:sdtContent>
-          <w:r>
-            <w:t xml:space="preserve">Motion to adjourn was made at </w:t>
-          </w:r>
-          <w:r>
-            <w:t>3</w:t>
-          </w:r>
-          <w:r>
-            <w:t>:</w:t>
-          </w:r>
-          <w:r>
-            <w:t>15</w:t>
-          </w:r>
-          <w:r>
-            <w:t xml:space="preserve"> p.m. and was passed unanimously.</w:t>
-          </w:r>
-        </w:sdtContent>
-      </w:sdt>
-      <w:r>
-        <w:t xml:space="preserve"> </w:t>
+        <w:t xml:space="preserve">  </w:t>
       </w:r>
     </w:p>
     <w:sectPr>
@@ -1549,6 +1480,118 @@
     </w:lvl>
   </w:abstractNum>
   <w:abstractNum w:abstractNumId="17" w15:restartNumberingAfterBreak="0">
+    <w:nsid w:val="5F243B52"/>
+    <w:multiLevelType w:val="hybridMultilevel"/>
+    <w:tmpl w:val="C40455BE"/>
+    <w:lvl w:ilvl="0" w:tplc="F5181C7A">
+      <w:numFmt w:val="bullet"/>
+      <w:lvlText w:val="-"/>
+      <w:lvlJc w:val="left"/>
+      <w:pPr>
+        <w:ind w:left="720" w:hanging="360"/>
+      </w:pPr>
+      <w:rPr>
+        <w:rFonts w:ascii="Century Gothic" w:eastAsiaTheme="minorEastAsia" w:hAnsi="Century Gothic" w:cstheme="minorBidi" w:hint="default"/>
+      </w:rPr>
+    </w:lvl>
+    <w:lvl w:ilvl="1" w:tplc="08090003" w:tentative="1">
+      <w:start w:val="1"/>
+      <w:numFmt w:val="bullet"/>
+      <w:lvlText w:val="o"/>
+      <w:lvlJc w:val="left"/>
+      <w:pPr>
+        <w:ind w:left="1440" w:hanging="360"/>
+      </w:pPr>
+      <w:rPr>
+        <w:rFonts w:ascii="Courier New" w:hAnsi="Courier New" w:cs="Courier New" w:hint="default"/>
+      </w:rPr>
+    </w:lvl>
+    <w:lvl w:ilvl="2" w:tplc="08090005" w:tentative="1">
+      <w:start w:val="1"/>
+      <w:numFmt w:val="bullet"/>
+      <w:lvlText w:val=""/>
+      <w:lvlJc w:val="left"/>
+      <w:pPr>
+        <w:ind w:left="2160" w:hanging="360"/>
+      </w:pPr>
+      <w:rPr>
+        <w:rFonts w:ascii="Wingdings" w:hAnsi="Wingdings" w:hint="default"/>
+      </w:rPr>
+    </w:lvl>
+    <w:lvl w:ilvl="3" w:tplc="08090001" w:tentative="1">
+      <w:start w:val="1"/>
+      <w:numFmt w:val="bullet"/>
+      <w:lvlText w:val=""/>
+      <w:lvlJc w:val="left"/>
+      <w:pPr>
+        <w:ind w:left="2880" w:hanging="360"/>
+      </w:pPr>
+      <w:rPr>
+        <w:rFonts w:ascii="Symbol" w:hAnsi="Symbol" w:hint="default"/>
+      </w:rPr>
+    </w:lvl>
+    <w:lvl w:ilvl="4" w:tplc="08090003" w:tentative="1">
+      <w:start w:val="1"/>
+      <w:numFmt w:val="bullet"/>
+      <w:lvlText w:val="o"/>
+      <w:lvlJc w:val="left"/>
+      <w:pPr>
+        <w:ind w:left="3600" w:hanging="360"/>
+      </w:pPr>
+      <w:rPr>
+        <w:rFonts w:ascii="Courier New" w:hAnsi="Courier New" w:cs="Courier New" w:hint="default"/>
+      </w:rPr>
+    </w:lvl>
+    <w:lvl w:ilvl="5" w:tplc="08090005" w:tentative="1">
+      <w:start w:val="1"/>
+      <w:numFmt w:val="bullet"/>
+      <w:lvlText w:val=""/>
+      <w:lvlJc w:val="left"/>
+      <w:pPr>
+        <w:ind w:left="4320" w:hanging="360"/>
+      </w:pPr>
+      <w:rPr>
+        <w:rFonts w:ascii="Wingdings" w:hAnsi="Wingdings" w:hint="default"/>
+      </w:rPr>
+    </w:lvl>
+    <w:lvl w:ilvl="6" w:tplc="08090001" w:tentative="1">
+      <w:start w:val="1"/>
+      <w:numFmt w:val="bullet"/>
+      <w:lvlText w:val=""/>
+      <w:lvlJc w:val="left"/>
+      <w:pPr>
+        <w:ind w:left="5040" w:hanging="360"/>
+      </w:pPr>
+      <w:rPr>
+        <w:rFonts w:ascii="Symbol" w:hAnsi="Symbol" w:hint="default"/>
+      </w:rPr>
+    </w:lvl>
+    <w:lvl w:ilvl="7" w:tplc="08090003" w:tentative="1">
+      <w:start w:val="1"/>
+      <w:numFmt w:val="bullet"/>
+      <w:lvlText w:val="o"/>
+      <w:lvlJc w:val="left"/>
+      <w:pPr>
+        <w:ind w:left="5760" w:hanging="360"/>
+      </w:pPr>
+      <w:rPr>
+        <w:rFonts w:ascii="Courier New" w:hAnsi="Courier New" w:cs="Courier New" w:hint="default"/>
+      </w:rPr>
+    </w:lvl>
+    <w:lvl w:ilvl="8" w:tplc="08090005" w:tentative="1">
+      <w:start w:val="1"/>
+      <w:numFmt w:val="bullet"/>
+      <w:lvlText w:val=""/>
+      <w:lvlJc w:val="left"/>
+      <w:pPr>
+        <w:ind w:left="6480" w:hanging="360"/>
+      </w:pPr>
+      <w:rPr>
+        <w:rFonts w:ascii="Wingdings" w:hAnsi="Wingdings" w:hint="default"/>
+      </w:rPr>
+    </w:lvl>
+  </w:abstractNum>
+  <w:abstractNum w:abstractNumId="18" w15:restartNumberingAfterBreak="0">
     <w:nsid w:val="62435FA5"/>
     <w:multiLevelType w:val="hybridMultilevel"/>
     <w:tmpl w:val="2EC480EC"/>
@@ -1637,7 +1680,7 @@
       </w:pPr>
     </w:lvl>
   </w:abstractNum>
-  <w:abstractNum w:abstractNumId="18" w15:restartNumberingAfterBreak="0">
+  <w:abstractNum w:abstractNumId="19" w15:restartNumberingAfterBreak="0">
     <w:nsid w:val="694D771C"/>
     <w:multiLevelType w:val="hybridMultilevel"/>
     <w:tmpl w:val="6D200186"/>
@@ -1750,7 +1793,7 @@
       </w:rPr>
     </w:lvl>
   </w:abstractNum>
-  <w:abstractNum w:abstractNumId="19" w15:restartNumberingAfterBreak="0">
+  <w:abstractNum w:abstractNumId="20" w15:restartNumberingAfterBreak="0">
     <w:nsid w:val="6CA95284"/>
     <w:multiLevelType w:val="hybridMultilevel"/>
     <w:tmpl w:val="8DB4B09E"/>
@@ -1864,7 +1907,7 @@
       </w:rPr>
     </w:lvl>
   </w:abstractNum>
-  <w:abstractNum w:abstractNumId="20" w15:restartNumberingAfterBreak="0">
+  <w:abstractNum w:abstractNumId="21" w15:restartNumberingAfterBreak="0">
     <w:nsid w:val="6E772A34"/>
     <w:multiLevelType w:val="hybridMultilevel"/>
     <w:tmpl w:val="04CC4962"/>
@@ -1976,7 +2019,7 @@
       </w:rPr>
     </w:lvl>
   </w:abstractNum>
-  <w:abstractNum w:abstractNumId="21" w15:restartNumberingAfterBreak="0">
+  <w:abstractNum w:abstractNumId="22" w15:restartNumberingAfterBreak="0">
     <w:nsid w:val="75E8095A"/>
     <w:multiLevelType w:val="hybridMultilevel"/>
     <w:tmpl w:val="A000C520"/>
@@ -2088,7 +2131,7 @@
       </w:rPr>
     </w:lvl>
   </w:abstractNum>
-  <w:abstractNum w:abstractNumId="22" w15:restartNumberingAfterBreak="0">
+  <w:abstractNum w:abstractNumId="23" w15:restartNumberingAfterBreak="0">
     <w:nsid w:val="78547920"/>
     <w:multiLevelType w:val="hybridMultilevel"/>
     <w:tmpl w:val="DF8C8114"/>
@@ -2204,7 +2247,7 @@
     <w:abstractNumId w:val="15"/>
   </w:num>
   <w:num w:numId="2">
-    <w:abstractNumId w:val="17"/>
+    <w:abstractNumId w:val="18"/>
   </w:num>
   <w:num w:numId="3">
     <w:abstractNumId w:val="12"/>
@@ -2246,13 +2289,13 @@
     <w:abstractNumId w:val="0"/>
   </w:num>
   <w:num w:numId="16">
-    <w:abstractNumId w:val="18"/>
+    <w:abstractNumId w:val="19"/>
   </w:num>
   <w:num w:numId="17">
-    <w:abstractNumId w:val="20"/>
+    <w:abstractNumId w:val="21"/>
   </w:num>
   <w:num w:numId="18">
-    <w:abstractNumId w:val="19"/>
+    <w:abstractNumId w:val="20"/>
   </w:num>
   <w:num w:numId="19">
     <w:abstractNumId w:val="9"/>
@@ -2261,16 +2304,19 @@
     <w:abstractNumId w:val="16"/>
   </w:num>
   <w:num w:numId="21">
-    <w:abstractNumId w:val="21"/>
+    <w:abstractNumId w:val="22"/>
   </w:num>
   <w:num w:numId="22">
-    <w:abstractNumId w:val="22"/>
+    <w:abstractNumId w:val="23"/>
   </w:num>
   <w:num w:numId="23">
     <w:abstractNumId w:val="14"/>
   </w:num>
   <w:num w:numId="24">
     <w:abstractNumId w:val="11"/>
+  </w:num>
+  <w:num w:numId="25">
+    <w:abstractNumId w:val="17"/>
   </w:num>
 </w:numbering>
 </file>
@@ -27621,32 +27667,6 @@
     </w:docPart>
     <w:docPart>
       <w:docPartPr>
-        <w:name w:val="8711DA350F0E4AA7A155F20F3B3A55F3"/>
-        <w:category>
-          <w:name w:val="General"/>
-          <w:gallery w:val="placeholder"/>
-        </w:category>
-        <w:types>
-          <w:type w:val="bbPlcHdr"/>
-        </w:types>
-        <w:behaviors>
-          <w:behavior w:val="content"/>
-        </w:behaviors>
-        <w:guid w:val="{41B983C4-8456-4F98-8ED9-6B85E1F470EA}"/>
-      </w:docPartPr>
-      <w:docPartBody>
-        <w:p>
-          <w:pPr>
-            <w:pStyle w:val="8711DA350F0E4AA7A155F20F3B3A55F3"/>
-          </w:pPr>
-          <w:r>
-            <w:t>Next meeting</w:t>
-          </w:r>
-        </w:p>
-      </w:docPartBody>
-    </w:docPart>
-    <w:docPart>
-      <w:docPartPr>
         <w:name w:val="6786ACD5CC4241E1AEE3238FFE948807"/>
         <w:category>
           <w:name w:val="General"/>
@@ -27778,44 +27798,6 @@
         </w:p>
       </w:docPartBody>
     </w:docPart>
-    <w:docPart>
-      <w:docPartPr>
-        <w:name w:val="95974D562C8E4C2B8678C50586F60087"/>
-        <w:category>
-          <w:name w:val="General"/>
-          <w:gallery w:val="placeholder"/>
-        </w:category>
-        <w:types>
-          <w:type w:val="bbPlcHdr"/>
-        </w:types>
-        <w:behaviors>
-          <w:behavior w:val="content"/>
-        </w:behaviors>
-        <w:guid w:val="{4EAB1D8B-F8D6-4F86-BE2B-D3C3459F57FB}"/>
-      </w:docPartPr>
-      <w:docPartBody>
-        <w:p>
-          <w:pPr>
-            <w:pStyle w:val="95974D562C8E4C2B8678C50586F60087"/>
-          </w:pPr>
-          <w:r>
-            <w:t xml:space="preserve">Motion to adjourn was made at </w:t>
-          </w:r>
-          <w:r>
-            <w:t>3</w:t>
-          </w:r>
-          <w:r>
-            <w:t>:</w:t>
-          </w:r>
-          <w:r>
-            <w:t>15</w:t>
-          </w:r>
-          <w:r>
-            <w:t xml:space="preserve"> p.m. and was passed unanimously.</w:t>
-          </w:r>
-        </w:p>
-      </w:docPartBody>
-    </w:docPart>
   </w:docParts>
 </w:glossaryDocument>
 </file>
@@ -28198,6 +28180,7 @@
     <w:rsid w:val="00C31821"/>
     <w:rsid w:val="00C757B8"/>
     <w:rsid w:val="00CD3B42"/>
+    <w:rsid w:val="00D1319A"/>
     <w:rsid w:val="00D634D6"/>
     <w:rsid w:val="00EF65ED"/>
     <w:rsid w:val="00FD20F5"/>
@@ -28676,9 +28659,6 @@
       <w:color w:val="833C0B" w:themeColor="accent2" w:themeShade="80"/>
     </w:rPr>
   </w:style>
-  <w:style w:type="paragraph" w:customStyle="1" w:styleId="025674DA240A464DA1F6151594B3165A">
-    <w:name w:val="025674DA240A464DA1F6151594B3165A"/>
-  </w:style>
   <w:style w:type="paragraph" w:styleId="ListBullet">
     <w:name w:val="List Bullet"/>
     <w:basedOn w:val="Normal"/>
@@ -28701,9 +28681,6 @@
       <w:lang w:eastAsia="ja-JP"/>
     </w:rPr>
   </w:style>
-  <w:style w:type="paragraph" w:customStyle="1" w:styleId="3B68DE8700B03141A599CBF52DC3A59D">
-    <w:name w:val="3B68DE8700B03141A599CBF52DC3A59D"/>
-  </w:style>
   <w:style w:type="character" w:styleId="PlaceholderText">
     <w:name w:val="Placeholder Text"/>
     <w:basedOn w:val="DefaultParagraphFont"/>
@@ -28717,66 +28694,6 @@
   </w:style>
   <w:style w:type="paragraph" w:customStyle="1" w:styleId="AD15D493E18C4C4B8CE11101B8B887E8">
     <w:name w:val="AD15D493E18C4C4B8CE11101B8B887E8"/>
-    <w:rsid w:val="006D17AF"/>
-    <w:pPr>
-      <w:spacing w:after="160" w:line="259" w:lineRule="auto"/>
-    </w:pPr>
-    <w:rPr>
-      <w:sz w:val="22"/>
-      <w:szCs w:val="22"/>
-      <w:lang w:val="en-AU" w:eastAsia="en-AU"/>
-    </w:rPr>
-  </w:style>
-  <w:style w:type="paragraph" w:customStyle="1" w:styleId="102754F3F70F46AFA96AE61369753842">
-    <w:name w:val="102754F3F70F46AFA96AE61369753842"/>
-    <w:rsid w:val="006D17AF"/>
-    <w:pPr>
-      <w:spacing w:after="160" w:line="259" w:lineRule="auto"/>
-    </w:pPr>
-    <w:rPr>
-      <w:sz w:val="22"/>
-      <w:szCs w:val="22"/>
-      <w:lang w:val="en-AU" w:eastAsia="en-AU"/>
-    </w:rPr>
-  </w:style>
-  <w:style w:type="paragraph" w:customStyle="1" w:styleId="FA357A4D103A4C369E99567990573C61">
-    <w:name w:val="FA357A4D103A4C369E99567990573C61"/>
-    <w:rsid w:val="006D17AF"/>
-    <w:pPr>
-      <w:spacing w:after="160" w:line="259" w:lineRule="auto"/>
-    </w:pPr>
-    <w:rPr>
-      <w:sz w:val="22"/>
-      <w:szCs w:val="22"/>
-      <w:lang w:val="en-AU" w:eastAsia="en-AU"/>
-    </w:rPr>
-  </w:style>
-  <w:style w:type="paragraph" w:customStyle="1" w:styleId="ACEBB50C4E6A4988804225D6F1DC5218">
-    <w:name w:val="ACEBB50C4E6A4988804225D6F1DC5218"/>
-    <w:rsid w:val="006D17AF"/>
-    <w:pPr>
-      <w:spacing w:after="160" w:line="259" w:lineRule="auto"/>
-    </w:pPr>
-    <w:rPr>
-      <w:sz w:val="22"/>
-      <w:szCs w:val="22"/>
-      <w:lang w:val="en-AU" w:eastAsia="en-AU"/>
-    </w:rPr>
-  </w:style>
-  <w:style w:type="paragraph" w:customStyle="1" w:styleId="79C06C7B88BE4DB3BE7AF6CBCE81DE1B">
-    <w:name w:val="79C06C7B88BE4DB3BE7AF6CBCE81DE1B"/>
-    <w:rsid w:val="006D17AF"/>
-    <w:pPr>
-      <w:spacing w:after="160" w:line="259" w:lineRule="auto"/>
-    </w:pPr>
-    <w:rPr>
-      <w:sz w:val="22"/>
-      <w:szCs w:val="22"/>
-      <w:lang w:val="en-AU" w:eastAsia="en-AU"/>
-    </w:rPr>
-  </w:style>
-  <w:style w:type="paragraph" w:customStyle="1" w:styleId="A269B70BC5B744B891B280ED003964C7">
-    <w:name w:val="A269B70BC5B744B891B280ED003964C7"/>
     <w:rsid w:val="006D17AF"/>
     <w:pPr>
       <w:spacing w:after="160" w:line="259" w:lineRule="auto"/>
@@ -28817,18 +28734,6 @@
       <w:sz w:val="22"/>
       <w:szCs w:val="21"/>
       <w:lang w:eastAsia="ja-JP"/>
-    </w:rPr>
-  </w:style>
-  <w:style w:type="paragraph" w:customStyle="1" w:styleId="982C5EC9A9FF42A48B3C0D01113ABEC6">
-    <w:name w:val="982C5EC9A9FF42A48B3C0D01113ABEC6"/>
-    <w:rsid w:val="006D17AF"/>
-    <w:pPr>
-      <w:spacing w:after="160" w:line="259" w:lineRule="auto"/>
-    </w:pPr>
-    <w:rPr>
-      <w:sz w:val="22"/>
-      <w:szCs w:val="22"/>
-      <w:lang w:val="en-AU" w:eastAsia="en-AU"/>
     </w:rPr>
   </w:style>
   <w:style w:type="paragraph" w:customStyle="1" w:styleId="8711DA350F0E4AA7A155F20F3B3A55F3">
@@ -28926,8 +28831,8 @@
       <w:lang w:val="en-AU" w:eastAsia="en-AU"/>
     </w:rPr>
   </w:style>
-  <w:style w:type="paragraph" w:customStyle="1" w:styleId="C348C5EC453841C0A0286B4AF75E6EB1">
-    <w:name w:val="C348C5EC453841C0A0286B4AF75E6EB1"/>
+  <w:style w:type="paragraph" w:customStyle="1" w:styleId="5C6D10E6604745F9B299A0CD41AA1ADE">
+    <w:name w:val="5C6D10E6604745F9B299A0CD41AA1ADE"/>
     <w:rsid w:val="006D17AF"/>
     <w:pPr>
       <w:spacing w:after="160" w:line="259" w:lineRule="auto"/>
@@ -28938,44 +28843,8 @@
       <w:lang w:val="en-AU" w:eastAsia="en-AU"/>
     </w:rPr>
   </w:style>
-  <w:style w:type="paragraph" w:customStyle="1" w:styleId="5C6D10E6604745F9B299A0CD41AA1ADE">
-    <w:name w:val="5C6D10E6604745F9B299A0CD41AA1ADE"/>
-    <w:rsid w:val="006D17AF"/>
-    <w:pPr>
-      <w:spacing w:after="160" w:line="259" w:lineRule="auto"/>
-    </w:pPr>
-    <w:rPr>
-      <w:sz w:val="22"/>
-      <w:szCs w:val="22"/>
-      <w:lang w:val="en-AU" w:eastAsia="en-AU"/>
-    </w:rPr>
-  </w:style>
-  <w:style w:type="paragraph" w:customStyle="1" w:styleId="50B71F563F0C42FC9CD2E301F9F0B422">
-    <w:name w:val="50B71F563F0C42FC9CD2E301F9F0B422"/>
-    <w:rsid w:val="006D17AF"/>
-    <w:pPr>
-      <w:spacing w:after="160" w:line="259" w:lineRule="auto"/>
-    </w:pPr>
-    <w:rPr>
-      <w:sz w:val="22"/>
-      <w:szCs w:val="22"/>
-      <w:lang w:val="en-AU" w:eastAsia="en-AU"/>
-    </w:rPr>
-  </w:style>
   <w:style w:type="paragraph" w:customStyle="1" w:styleId="A2427E123DB34D34B787BE77C03A5510">
     <w:name w:val="A2427E123DB34D34B787BE77C03A5510"/>
-    <w:rsid w:val="006D17AF"/>
-    <w:pPr>
-      <w:spacing w:after="160" w:line="259" w:lineRule="auto"/>
-    </w:pPr>
-    <w:rPr>
-      <w:sz w:val="22"/>
-      <w:szCs w:val="22"/>
-      <w:lang w:val="en-AU" w:eastAsia="en-AU"/>
-    </w:rPr>
-  </w:style>
-  <w:style w:type="paragraph" w:customStyle="1" w:styleId="AF1EA365FCE040A7AA3028CDCD4016F8">
-    <w:name w:val="AF1EA365FCE040A7AA3028CDCD4016F8"/>
     <w:rsid w:val="006D17AF"/>
     <w:pPr>
       <w:spacing w:after="160" w:line="259" w:lineRule="auto"/>
@@ -29022,20 +28891,6 @@
     <w:rPr>
       <w:color w:val="44546A" w:themeColor="text2"/>
       <w:sz w:val="22"/>
-      <w:szCs w:val="21"/>
-      <w:lang w:eastAsia="ja-JP"/>
-    </w:rPr>
-  </w:style>
-  <w:style w:type="paragraph" w:customStyle="1" w:styleId="D7AAF0B1A3BC4E04A1DD2A9BEE0DEB29">
-    <w:name w:val="D7AAF0B1A3BC4E04A1DD2A9BEE0DEB29"/>
-    <w:rsid w:val="00C31821"/>
-    <w:pPr>
-      <w:spacing w:before="40" w:after="40"/>
-      <w:outlineLvl w:val="1"/>
-    </w:pPr>
-    <w:rPr>
-      <w:rFonts w:asciiTheme="majorHAnsi" w:eastAsiaTheme="majorEastAsia" w:hAnsiTheme="majorHAnsi" w:cstheme="majorBidi"/>
-      <w:color w:val="44546A" w:themeColor="text2"/>
       <w:szCs w:val="21"/>
       <w:lang w:eastAsia="ja-JP"/>
     </w:rPr>
@@ -29315,6 +29170,15 @@
 </file>
 
 <file path=customXml/item1.xml><?xml version="1.0" encoding="utf-8"?>
+<?mso-contentType ?>
+<FormTemplates xmlns="http://schemas.microsoft.com/sharepoint/v3/contenttype/forms">
+  <Display>DocumentLibraryForm</Display>
+  <Edit>DocumentLibraryForm</Edit>
+  <New>DocumentLibraryForm</New>
+</FormTemplates>
+</file>
+
+<file path=customXml/item2.xml><?xml version="1.0" encoding="utf-8"?>
 <p:properties xmlns:p="http://schemas.microsoft.com/office/2006/metadata/properties" xmlns:xsi="http://www.w3.org/2001/XMLSchema-instance" xmlns:pc="http://schemas.microsoft.com/office/infopath/2007/PartnerControls">
   <documentManagement>
     <_ip_UnifiedCompliancePolicyUIAction xmlns="http://schemas.microsoft.com/sharepoint/v3" xsi:nil="true"/>
@@ -29332,15 +29196,6 @@
     <MediaServiceKeyPoints xmlns="71af3243-3dd4-4a8d-8c0d-dd76da1f02a5" xsi:nil="true"/>
   </documentManagement>
 </p:properties>
-</file>
-
-<file path=customXml/item2.xml><?xml version="1.0" encoding="utf-8"?>
-<?mso-contentType ?>
-<FormTemplates xmlns="http://schemas.microsoft.com/sharepoint/v3/contenttype/forms">
-  <Display>DocumentLibraryForm</Display>
-  <Edit>DocumentLibraryForm</Edit>
-  <New>DocumentLibraryForm</New>
-</FormTemplates>
 </file>
 
 <file path=customXml/item3.xml><?xml version="1.0" encoding="utf-8"?>
@@ -29644,6 +29499,14 @@
 </file>
 
 <file path=customXml/itemProps1.xml><?xml version="1.0" encoding="utf-8"?>
+<ds:datastoreItem xmlns:ds="http://schemas.openxmlformats.org/officeDocument/2006/customXml" ds:itemID="{A6C31FF1-EA06-400B-8C8A-01C8A51939C6}">
+  <ds:schemaRefs>
+    <ds:schemaRef ds:uri="http://schemas.microsoft.com/sharepoint/v3/contenttype/forms"/>
+  </ds:schemaRefs>
+</ds:datastoreItem>
+</file>
+
+<file path=customXml/itemProps2.xml><?xml version="1.0" encoding="utf-8"?>
 <ds:datastoreItem xmlns:ds="http://schemas.openxmlformats.org/officeDocument/2006/customXml" ds:itemID="{F76251CB-1FFE-4696-9AC1-B4C3840DD720}">
   <ds:schemaRefs>
     <ds:schemaRef ds:uri="http://schemas.microsoft.com/office/2006/metadata/properties"/>
@@ -29651,14 +29514,6 @@
     <ds:schemaRef ds:uri="http://schemas.microsoft.com/sharepoint/v3"/>
     <ds:schemaRef ds:uri="71af3243-3dd4-4a8d-8c0d-dd76da1f02a5"/>
     <ds:schemaRef ds:uri="230e9df3-be65-4c73-a93b-d1236ebd677e"/>
-  </ds:schemaRefs>
-</ds:datastoreItem>
-</file>
-
-<file path=customXml/itemProps2.xml><?xml version="1.0" encoding="utf-8"?>
-<ds:datastoreItem xmlns:ds="http://schemas.openxmlformats.org/officeDocument/2006/customXml" ds:itemID="{A6C31FF1-EA06-400B-8C8A-01C8A51939C6}">
-  <ds:schemaRefs>
-    <ds:schemaRef ds:uri="http://schemas.microsoft.com/sharepoint/v3/contenttype/forms"/>
   </ds:schemaRefs>
 </ds:datastoreItem>
 </file>

</xml_diff>